<commit_message>
refactor: exec report addressed to Meridian Digital decision maker; visible page pager
- Executive report (docx/pdf) rewritten for the fictional agency (Meridian
  Digital), framed as recommendations to the decision maker; removed
  open-access/free-licensing references and the hypothetical-data note
  (kept once in the README).
- Dashboard navigation replaced with a visible page pager (prev/next +
  1/2/3 buttons) and per-page header.
</commit_message>
<xml_diff>
--- a/docs/executive_report.docx
+++ b/docs/executive_report.docx
@@ -22,7 +22,7 @@
         <w:rPr>
           <w:b/>
         </w:rPr>
-        <w:t>Project Manager Selection Process  ·  Recruiting Dashboard</w:t>
+        <w:t>Project Manager Selection Process  ·  Meridian Digital</w:t>
       </w:r>
     </w:p>
     <w:p>
@@ -30,18 +30,10 @@
         <w:jc w:val="center"/>
       </w:pPr>
       <w:r>
-        <w:t>Prepared for a digital marketing agency  ·  October 12, 2026</w:t>
+        <w:t>Prepared for the decision maker  ·  October 12, 2026</w:t>
       </w:r>
     </w:p>
     <w:p/>
-    <w:p>
-      <w:r>
-        <w:rPr>
-          <w:i/>
-        </w:rPr>
-        <w:t>Note: this demonstration uses a hypothetical applicant dataset generated for portfolio purposes and follows the methodological steps of a real selection process.</w:t>
-      </w:r>
-    </w:p>
     <w:p>
       <w:pPr>
         <w:spacing w:before="240"/>
@@ -59,7 +51,7 @@
         <w:rPr>
           <w:b w:val="0"/>
         </w:rPr>
-        <w:t>This report presents a complete candidate evaluation and selection process for a Project Manager role in a digital marketing agency, executed end-to-end with an open-source, zero-licensing psychometric stack. 30 applicants were evaluated across document/CV review, four psychometric instruments (cognitive ability, personality, integrity and vocational interests), two structured interviews and an assessment center. All evidence was consolidated into an interactive dashboard and a single weighted fit index (0-100).</w:t>
+        <w:t>This report presents the results of a complete evaluation and selection process for the Project Manager role at Meridian Digital. 30 applicants were assessed across document/CV review, four psychometric instruments (cognitive ability, personality, integrity and vocational interests), two structured interviews and an assessment center. All evidence was consolidated into an interactive dashboard and a single weighted fit index (0-100) anchored to the role's target profile.</w:t>
       </w:r>
     </w:p>
     <w:p>
@@ -67,7 +59,7 @@
         <w:rPr>
           <w:b w:val="0"/>
         </w:rPr>
-        <w:t>The structured process delivered measurable, model-based gains:</w:t>
+        <w:t>The process delivered measurable gains for the agency:</w:t>
       </w:r>
     </w:p>
     <w:p>
@@ -75,7 +67,7 @@
         <w:pStyle w:val="ListBullet"/>
       </w:pPr>
       <w:r>
-        <w:t>1. +16.7% higher expected fit vs. experience-based hiring: selecting the top three candidates by the fit index (mean 90.2) instead of the three most experienced (mean 77.3) raises expected person-job fit by 12.9 points per hire.</w:t>
+        <w:t>1. Higher expected fit than experience-based hiring: selecting the three candidates with the highest fit index (mean 90.2) instead of the three most experienced (mean 77.3) raises expected person-job fit by 12.9 points per hire (+17%).</w:t>
       </w:r>
     </w:p>
     <w:p>
@@ -83,7 +75,7 @@
         <w:pStyle w:val="ListBullet"/>
       </w:pPr>
       <w:r>
-        <w:t>2. ~40% faster time-to-hire: a digital, self-administered battery with automated scoring replaces a typically multi-week evaluation with a process completed in days, freeing HR analyst time per requisition.</w:t>
+        <w:t>2. Faster time-to-hire: a digitally delivered battery with automated scoring replaces a typically multi-week evaluation with a process completed in days.</w:t>
       </w:r>
     </w:p>
     <w:p>
@@ -91,15 +83,7 @@
         <w:pStyle w:val="ListBullet"/>
       </w:pPr>
       <w:r>
-        <w:t>3. ~30% lower early-turnover risk: automated screening by the fit index flagged 8 of 30 applicants (27%) as clearly below the target profile (fit &lt; 55) that a CV-only screen would likely have passed.</w:t>
-      </w:r>
-    </w:p>
-    <w:p>
-      <w:pPr>
-        <w:pStyle w:val="ListBullet"/>
-      </w:pPr>
-      <w:r>
-        <w:t>4. $0 licensing cost: the full battery is public-domain / open-access. Commercial psychometric suites typically cost 150-400 USD per evaluated candidate.</w:t>
+        <w:t>3. Lower early-turnover risk: automated screening by the fit index flagged 8 of 30 applicants (27%) as clearly below the target profile, candidates who would likely have passed a CV-only screen.</w:t>
       </w:r>
     </w:p>
     <w:p>
@@ -107,7 +91,7 @@
         <w:rPr>
           <w:b w:val="0"/>
         </w:rPr>
-        <w:t>Recommended shortlist: Fernanda Aguilar (fit 91.7), Alejandra Perez (fit 73.6) and Gabriela Perez (fit 82.3) - three distinct profiles handed to the decision maker with full evidence in the dashboard.</w:t>
+        <w:t>Recommended shortlist: Fernanda Aguilar (91.7), Alejandra Perez (73.6) and Gabriela Perez (82.3) - three distinct profiles, with full evidence available in the dashboard.</w:t>
       </w:r>
     </w:p>
     <w:p>
@@ -127,7 +111,7 @@
         <w:rPr>
           <w:b w:val="0"/>
         </w:rPr>
-        <w:t>Hiring a Project Manager in a digital agency is a high-stakes, multi-dimensional decision. A poor hire surfaces as delayed campaigns, margin erosion, client churn and early attrition - typically during the first year, when the investment is hardest to recover. In practice, selection is often decided by CV screening and unstructured interviews ('gut feel'), which are fast but inconsistent: they overweight experience, miss personality-integrity risks and abandon candidates whose strengths are measurable but not visible on paper.</w:t>
+        <w:t>The Project Manager is the node between client expectations, creative and media teams, budgets and delivery dates at Meridian Digital. A poor hire materializes as delayed campaigns, margin erosion, client churn and early attrition - typically within the first year, when the investment is hardest to recover. Selection that leans on CV screening and unstructured interviews tends to overweight experience and underweight the measurable signals that most predict performance: structured personality, cognitive ability, integrity and vocational fit.</w:t>
       </w:r>
     </w:p>
     <w:p>
@@ -135,7 +119,7 @@
         <w:rPr>
           <w:b w:val="0"/>
         </w:rPr>
-        <w:t>This project addresses the problem directly: it designs and demonstrates an evidence-based selection system that (1) anchors every decision to a defined job profile, (2) measures the full construct set relevant to the role - cognitive ability, personality, integrity and vocational interests - with standardized open-access instruments, (3) combines objective scores with structured interviews and an assessment center, and (4) packages the result in an interactive dashboard that management can explore before deciding.</w:t>
+        <w:t>Meridian Digital asked for an evidence-based selection system: a defined target profile for the role, standardized instruments, structured interviews plus an assessment center for the strongest applicants, and a transparent way to compare every candidate on the same scale. This report presents the process, the results and the recommended decision.</w:t>
       </w:r>
     </w:p>
     <w:p>
@@ -155,7 +139,7 @@
         <w:rPr>
           <w:b/>
         </w:rPr>
-        <w:t>Job analysis and target profile.</w:t>
+        <w:t>Target profile.</w:t>
       </w:r>
     </w:p>
     <w:p>
@@ -163,7 +147,7 @@
         <w:rPr>
           <w:b w:val="0"/>
         </w:rPr>
-        <w:t>A competency model for the Project Manager role was built from the job description (see docs/job_description_PM.docx): a structured, delivery-oriented professional who coordinates creative, media and development squads, manages client stakeholders, controls budgets and performs under multi-project pressure. This produced explicit target zones per construct (e.g., Conscientiousness percentile 65-95; Neuroticism 10-40; integrity &gt;= P65; cognitive ability &gt;= P55).</w:t>
+        <w:t>A competency model for the role was defined from the job description (docs/job_description_PM.docx): a structured, delivery-oriented professional who coordinates squads, manages client stakeholders, controls budgets and performs under multi-project pressure. This produced explicit target zones per construct (e.g., Conscientiousness percentile 65-95; Neuroticism 10-40; integrity &gt;= P65; cognitive ability &gt;= P55).</w:t>
       </w:r>
     </w:p>
     <w:p>
@@ -171,7 +155,7 @@
         <w:rPr>
           <w:b/>
         </w:rPr>
-        <w:t>Psychometric instruments (all free / open-access).</w:t>
+        <w:t>Psychometric instruments.</w:t>
       </w:r>
     </w:p>
     <w:p>
@@ -179,7 +163,7 @@
         <w:pStyle w:val="ListBullet"/>
       </w:pPr>
       <w:r>
-        <w:t>Cognitive ability - ICAR, International Cognitive Ability Resource (Condon &amp; Revelle, 2014). 16 items, four item types (matrix reasoning, letter-number series, verbal reasoning, 3D rotation); 2-PL IRT scoring; percentile against the published reference distribution.</w:t>
+        <w:t>Cognitive ability - ICAR (Condon &amp; Revelle, 2014). 16 items in four item types (matrix reasoning, letter-number series, verbal reasoning, 3D rotation); IRT-based scoring; percentile against the normative reference distribution.</w:t>
       </w:r>
     </w:p>
     <w:p>
@@ -187,7 +171,7 @@
         <w:pStyle w:val="ListBullet"/>
       </w:pPr>
       <w:r>
-        <w:t>Personality - IPIP-NEO-120 (Johnson, 2014). 120 public-domain items; five domains and thirty facets; summation scoring with reverse-coded items; sample percentiles.</w:t>
+        <w:t>Personality - IPIP-NEO-120 (Johnson, 2014). 120 items; five domains and thirty facets; summation scoring with reverse-coded items; percentiles within the applicant pool.</w:t>
       </w:r>
     </w:p>
     <w:p>
@@ -195,7 +179,7 @@
         <w:pStyle w:val="ListBullet"/>
       </w:pPr>
       <w:r>
-        <w:t>Integrity - IPIP-HEXACO Honesty-Humility scale (Ashton, Lee &amp; Goldberg, 2007). 10 items across Sincerity, Fairness, Greed-Avoidance and Modesty; mean scoring on recoded 5-point responses.</w:t>
+        <w:t>Integrity - Honesty-Humility scale of the HEXACO framework (Ashton, Lee &amp; Goldberg, 2007). 10 items across Sincerity, Fairness, Greed-Avoidance and Modesty; mean scoring on recoded responses.</w:t>
       </w:r>
     </w:p>
     <w:p>
@@ -203,7 +187,7 @@
         <w:pStyle w:val="ListBullet"/>
       </w:pPr>
       <w:r>
-        <w:t>Vocational interests - O*NET Interest Profiler / Mini Interest Profiler (U.S. Department of Labor). 30 RIASEC items (5 per scale); congruence with the role's ESC-dominant Holland profile via position-weighted code agreement.</w:t>
+        <w:t>Vocational interests - O*NET Interest Profiler (U.S. Department of Labor). RIASEC profile; congruence with the role's ESC-dominant Holland profile via position-weighted code agreement.</w:t>
       </w:r>
     </w:p>
     <w:p>
@@ -267,7 +251,7 @@
         <w:pStyle w:val="ListBullet"/>
       </w:pPr>
       <w:r>
-        <w:t>Assessment center (campaign-launch case under scope and budget pressure) with seven raters' competencies.</w:t>
+        <w:t>Assessment center (campaign-launch case under scope and budget pressure) rated on seven competencies.</w:t>
       </w:r>
     </w:p>
     <w:p>
@@ -283,7 +267,7 @@
         <w:rPr>
           <w:b w:val="0"/>
         </w:rPr>
-        <w:t>The dataset is hypothetical and generated for demonstration. Instrument structures, item banks (public-domain), scoring rules and target zones follow the published documentation cited above. Candidates were simulated realistically (30 applicants with varied experience, education and trait profiles) so the analytical behavior of the dashboard and report matches a real process.</w:t>
+        <w:t>An applicant pool of 30 candidates was compiled for the exercise, with document summaries, item-level test responses and assessment-center ratings consolidated in a database structured for scoring and reporting.</w:t>
       </w:r>
     </w:p>
     <w:p>
@@ -295,7 +279,7 @@
           <w:b/>
           <w:sz w:val="25"/>
         </w:rPr>
-        <w:t>4. Technology stack</w:t>
+        <w:t>4. Technology</w:t>
       </w:r>
     </w:p>
     <w:p>
@@ -311,7 +295,7 @@
         <w:pStyle w:val="ListBullet"/>
       </w:pPr>
       <w:r>
-        <w:t>Streamlit + Plotly (interactive dashboard, monospace minimal black/white/gray theme).</w:t>
+        <w:t>Streamlit + Plotly (interactive dashboard, monospace black/white/gray theme).</w:t>
       </w:r>
     </w:p>
     <w:p>
@@ -319,7 +303,7 @@
         <w:pStyle w:val="ListBullet"/>
       </w:pPr>
       <w:r>
-        <w:t>python-docx + reportlab (this deliverable).  Openpyxl (item bank data).</w:t>
+        <w:t>python-docx + reportlab (this deliverable). Openpyxl (item-bank data).</w:t>
       </w:r>
     </w:p>
     <w:p>
@@ -327,7 +311,7 @@
         <w:pStyle w:val="ListBullet"/>
       </w:pPr>
       <w:r>
-        <w:t>Git/GitHub (versioning). Hosting-ready for Streamlit Community Cloud.</w:t>
+        <w:t>Git/GitHub (version control); deployable to Streamlit Community Cloud.</w:t>
       </w:r>
     </w:p>
     <w:p>
@@ -347,7 +331,7 @@
         <w:rPr>
           <w:b w:val="0"/>
         </w:rPr>
-        <w:t>The algorithm evaluated 30 candidates. The fit index ranges from 42.8 to 91.7 (mean 68.4, SD 13.7), with 14 candidates in the High band (47%), 8 in Medium and 8 in Low. Percentiles are computed within the applicant pool so managers can compare candidates directly.</w:t>
+        <w:t>The system evaluated 30 candidates. The fit index ranges from 42.8 to 91.7 (mean 68.4, SD 13.7), with 14 candidates in the High band (47%), 8 in Medium and 8 in Low. Percentiles are computed within the applicant pool, so the whole slate can be compared on the same scale.</w:t>
       </w:r>
     </w:p>
     <w:p>
@@ -394,7 +378,7 @@
         <w:rPr>
           <w:i/>
         </w:rPr>
-        <w:t>Figure 1. Distribution of the overall fit index (vertical line: High band threshold).</w:t>
+        <w:t>Figure 1. Distribution of the overall fit index (dashed line: High-band threshold).</w:t>
       </w:r>
     </w:p>
     <w:p>
@@ -410,7 +394,7 @@
         <w:rPr>
           <w:b w:val="0"/>
         </w:rPr>
-        <w:t>Personality, cognitive ability and integrity show typical attainment near the target (mean 66-68), while interest congruence is naturally higher in an applicant pool that self-selects for the industry. BMI of the five components is balanced; the moderate correlations with the fit index (0.31-0.72) indicate that no single test dominates the decision.</w:t>
+        <w:t>The five components are balanced: no single test dominates the result. Cognitive and personality signals carry the strongest weight in the recommendation, while interest congruence is naturally high in an applicant pool that self-selects for the industry.</w:t>
       </w:r>
     </w:p>
     <w:p>
@@ -606,7 +590,7 @@
           </w:tcPr>
           <w:p>
             <w:r>
-              <w:t>Integrity (HEXACO H-H)</w:t>
+              <w:t>Integrity (Honesty-Humility)</w:t>
             </w:r>
           </w:p>
         </w:tc>
@@ -747,7 +731,7 @@
         <w:rPr>
           <w:b w:val="0"/>
         </w:rPr>
-        <w:t>Cognitive ability shows the strongest association with overall fit (r = 0.72). Personality competence correlates at 0.64 and integrity at 0.31; CV/documentation alone (r = 0.32) and years of experience (r = 0.48) are weak predictors of the final recommendation - reinforcing the value of the structured evidence beyond the CV.</w:t>
+        <w:t>Cognitive ability shows the strongest association with overall fit (r = 0.72), followed by personality (r = 0.64) and integrity (r = 0.31). CV/documentation alone (r = 0.32) and years of experience (r = 0.48) are weak predictors of the final recommendation - evidence that a CV-only screen would have sorted the slate differently.</w:t>
       </w:r>
     </w:p>
     <w:p>
@@ -2073,7 +2057,7 @@
         <w:rPr>
           <w:i/>
         </w:rPr>
-        <w:t>Table 3. Proposed shortlist handed to the decision maker.</w:t>
+        <w:t>Table 3. Proposed shortlist, ready for the hiring decision.</w:t>
       </w:r>
     </w:p>
     <w:p>
@@ -2101,7 +2085,7 @@
         <w:pStyle w:val="ListBullet"/>
       </w:pPr>
       <w:r>
-        <w:t>The multi-construct fit index integrates the full evidence base into one auditable number; its spread (min 42.8 / max 91.7) confirms it discriminates among applicants rather than returning a ceiling effect.</w:t>
+        <w:t>The fit index integrates the full evidence base into one auditable number; its range (42.8-91.7) confirms it discriminates among applicants rather than returning a ceiling effect.</w:t>
       </w:r>
     </w:p>
     <w:p>
@@ -2109,7 +2093,7 @@
         <w:pStyle w:val="ListBullet"/>
       </w:pPr>
       <w:r>
-        <w:t>Cognitive ability and structured personality indicators drive the decision; CV experience alone is a weak proxy for person-job fit (r = 0.48).</w:t>
+        <w:t>Structured cognitive and personality indicators drive the recommendation; experience alone is a weak proxy for person-job fit (r = 0.48).</w:t>
       </w:r>
     </w:p>
     <w:p>
@@ -2117,7 +2101,7 @@
         <w:pStyle w:val="ListBullet"/>
       </w:pPr>
       <w:r>
-        <w:t>The demonstration battery is free and fully traceable: every item, scoring rule and norm comes from published open-access documentation.</w:t>
+        <w:t>The dashboard gives Meridian Digital's decision maker full visibility: every candidate can be explored at the level of individual indicators and facets before a final offer.</w:t>
       </w:r>
     </w:p>
     <w:p>
@@ -2125,7 +2109,7 @@
         <w:rPr>
           <w:b/>
         </w:rPr>
-        <w:t>Recommendations.</w:t>
+        <w:t>Recommendations for Meridian Digital.</w:t>
       </w:r>
     </w:p>
     <w:p>
@@ -2133,7 +2117,7 @@
         <w:pStyle w:val="ListBullet"/>
       </w:pPr>
       <w:r>
-        <w:t>Adopt the fit-index workflow as the standard pre-offer gate; keep the assessment center for finalists only.</w:t>
+        <w:t>Adopt the fit-index workflow as the standard pre-offer gate for this role, and consider extending it to other agency positions.</w:t>
       </w:r>
     </w:p>
     <w:p>
@@ -2141,7 +2125,7 @@
         <w:pStyle w:val="ListBullet"/>
       </w:pPr>
       <w:r>
-        <w:t>Customize the component weights in scripts/project_config.py through a workshop with hiring managers, and recalibrate the High/Medium/Low bands after the first six months of performance data.</w:t>
+        <w:t>Use the assessment center for the finalists only, and keep interviews focused on evidence the instruments cannot capture.</w:t>
       </w:r>
     </w:p>
     <w:p>
@@ -2149,7 +2133,7 @@
         <w:pStyle w:val="ListBullet"/>
       </w:pPr>
       <w:r>
-        <w:t>Validate the index against on-the-job performance (engagement, retention, delivery KPIs) and monitor fairness by subgroup in the dashboard.</w:t>
+        <w:t>Recalibrate the component weights and the High/Medium/Low bands after six months of on-the-job performance data.</w:t>
       </w:r>
     </w:p>
     <w:p>
@@ -2157,7 +2141,7 @@
         <w:pStyle w:val="ListBullet"/>
       </w:pPr>
       <w:r>
-        <w:t>Automate the pipeline (data -&gt; scoring -&gt; dashboard) so each requisition reuses the same instruments, formats and reporting with no incremental licensing spend.</w:t>
+        <w:t>Assign a named decision maker to review the shortlist in the dashboard before the final offer.</w:t>
       </w:r>
     </w:p>
     <w:sectPr>

</xml_diff>

<commit_message>
feat: report as dashboard companion w/ results & hire recommendation; fix nav highlight
- Executive report (docx/pdf) refocused: detailed results (pool overview,
  fit distribution, component attainment, personality vs target bands,
  integrity, vocational interests, key relationships, full ranking) ending
  with a results-based selection recommendation of the three finalists to
  hire and next steps.
- Dashboard navigation rebuilt with st.pills + callbacks so the active
  page highlight always matches the selected page (prev/next and pill
  clicks stay in sync).
</commit_message>
<xml_diff>
--- a/docs/executive_report.docx
+++ b/docs/executive_report.docx
@@ -30,7 +30,7 @@
         <w:jc w:val="center"/>
       </w:pPr>
       <w:r>
-        <w:t>Prepared for the decision maker  ·  October 12, 2026</w:t>
+        <w:t>Companion to the recruiting dashboard  ·  October 12, 2026</w:t>
       </w:r>
     </w:p>
     <w:p/>
@@ -91,7 +91,7 @@
         <w:rPr>
           <w:b w:val="0"/>
         </w:rPr>
-        <w:t>Recommended shortlist: Fernanda Aguilar (91.7), Alejandra Perez (73.6) and Gabriela Perez (82.3) - three distinct profiles, with full evidence available in the dashboard.</w:t>
+        <w:t>This report complements the dashboard by detailing the results behind the numbers and closes with the selection recommendation: the three candidates recommended for hiring are Fernanda Aguilar (fit 91.7), Alejandra Perez (fit 73.6), Gabriela Perez (fit 82.3).</w:t>
       </w:r>
     </w:p>
     <w:p>
@@ -111,7 +111,7 @@
         <w:rPr>
           <w:b w:val="0"/>
         </w:rPr>
-        <w:t>The Project Manager is the node between client expectations, creative and media teams, budgets and delivery dates at Meridian Digital. A poor hire materializes as delayed campaigns, margin erosion, client churn and early attrition - typically within the first year, when the investment is hardest to recover. Selection that leans on CV screening and unstructured interviews tends to overweight experience and underweight the measurable signals that most predict performance: structured personality, cognitive ability, integrity and vocational fit.</w:t>
+        <w:t>The Project Manager is the node between client expectations, creative and media teams, budgets and delivery dates at Meridian Digital. A poor hire materializes as delayed campaigns, margin erosion, client churn and early attrition, typically within the first year. Selection that relies on CV screening and unstructured interviews overweights experience and underweights the signals that most predict performance: structured personality, cognitive ability, integrity and vocational fit.</w:t>
       </w:r>
     </w:p>
     <w:p>
@@ -119,7 +119,7 @@
         <w:rPr>
           <w:b w:val="0"/>
         </w:rPr>
-        <w:t>Meridian Digital asked for an evidence-based selection system: a defined target profile for the role, standardized instruments, structured interviews plus an assessment center for the strongest applicants, and a transparent way to compare every candidate on the same scale. This report presents the process, the results and the recommended decision.</w:t>
+        <w:t>Meridian Digital asked for an evidence-based selection system: a defined target profile, standardized instruments, structured interviews plus an assessment center for the strongest applicants, and a transparent way to compare candidates on the same scale. This report is the written companion to the interactive recruiting dashboard: it details the results behind every number and closes with the recommendation of the three candidates to hire.</w:t>
       </w:r>
     </w:p>
     <w:p>
@@ -137,17 +137,9 @@
     <w:p>
       <w:r>
         <w:rPr>
-          <w:b/>
-        </w:rPr>
-        <w:t>Target profile.</w:t>
-      </w:r>
-    </w:p>
-    <w:p>
-      <w:r>
-        <w:rPr>
           <w:b w:val="0"/>
         </w:rPr>
-        <w:t>A competency model for the role was defined from the job description (docs/job_description_PM.docx): a structured, delivery-oriented professional who coordinates squads, manages client stakeholders, controls budgets and performs under multi-project pressure. This produced explicit target zones per construct (e.g., Conscientiousness percentile 65-95; Neuroticism 10-40; integrity &gt;= P65; cognitive ability &gt;= P55).</w:t>
+        <w:t>A competency model for the role was defined from the job description (docs/job_description_PM.docx), producing explicit target zones per construct (e.g., Conscientiousness percentile 65-95; Neuroticism 10-40; integrity &gt;= P65; cognitive ability &gt;= P55).</w:t>
       </w:r>
     </w:p>
     <w:p>
@@ -163,7 +155,7 @@
         <w:pStyle w:val="ListBullet"/>
       </w:pPr>
       <w:r>
-        <w:t>Cognitive ability - ICAR (Condon &amp; Revelle, 2014). 16 items in four item types (matrix reasoning, letter-number series, verbal reasoning, 3D rotation); IRT-based scoring; percentile against the normative reference distribution.</w:t>
+        <w:t>Cognitive ability - ICAR (Condon &amp; Revelle, 2014): 16 items, four item types, IRT-based scoring.</w:t>
       </w:r>
     </w:p>
     <w:p>
@@ -171,7 +163,7 @@
         <w:pStyle w:val="ListBullet"/>
       </w:pPr>
       <w:r>
-        <w:t>Personality - IPIP-NEO-120 (Johnson, 2014). 120 items; five domains and thirty facets; summation scoring with reverse-coded items; percentiles within the applicant pool.</w:t>
+        <w:t>Personality - IPIP-NEO-120 (Johnson, 2014): 120 items, five domains and thirty facets.</w:t>
       </w:r>
     </w:p>
     <w:p>
@@ -179,7 +171,7 @@
         <w:pStyle w:val="ListBullet"/>
       </w:pPr>
       <w:r>
-        <w:t>Integrity - Honesty-Humility scale of the HEXACO framework (Ashton, Lee &amp; Goldberg, 2007). 10 items across Sincerity, Fairness, Greed-Avoidance and Modesty; mean scoring on recoded responses.</w:t>
+        <w:t>Integrity - Honesty-Humility scale of the HEXACO framework (Ashton, Lee &amp; Goldberg, 2007): 10 items, 4 facets.</w:t>
       </w:r>
     </w:p>
     <w:p>
@@ -187,15 +179,7 @@
         <w:pStyle w:val="ListBullet"/>
       </w:pPr>
       <w:r>
-        <w:t>Vocational interests - O*NET Interest Profiler (U.S. Department of Labor). RIASEC profile; congruence with the role's ESC-dominant Holland profile via position-weighted code agreement.</w:t>
-      </w:r>
-    </w:p>
-    <w:p>
-      <w:r>
-        <w:rPr>
-          <w:b/>
-        </w:rPr>
-        <w:t>Fit index.</w:t>
+        <w:t>Vocational interests - O*NET Interest Profiler (U.S. DOL): RIASEC congruence with the role's ESC-dominant profile.</w:t>
       </w:r>
     </w:p>
     <w:p>
@@ -203,7 +187,7 @@
         <w:rPr>
           <w:b w:val="0"/>
         </w:rPr>
-        <w:t>Each construct is expressed as a target-attainment score (0-100, where 100 means the target zone is reached). The overall fit index is the weighted sum: cognitive 20%, personality 35%, integrity 20%, interests 15% and CV/documentation 10%. Qualitative labels (High / Medium / Low) follow the bands &gt;= 72, 55-72 and &lt; 55.</w:t>
+        <w:t>Each construct maps to target-attainment (0-100); overall fit = cognitive 20% + personality 35% + integrity 20% + interests 15% + CV 10%. Labels: High &gt;= 72, Medium 55-72, Low &lt; 55. Percentiles are computed within the applicant pool so the whole slate is compared on the same scale.</w:t>
       </w:r>
     </w:p>
     <w:p>
@@ -219,7 +203,7 @@
         <w:pStyle w:val="ListBullet"/>
       </w:pPr>
       <w:r>
-        <w:t>Document and CV review, scored with an explicit rubric (education, experience curve, certifications).</w:t>
+        <w:t>Document and CV review (explicit rubric: education, experience curve, certifications).</w:t>
       </w:r>
     </w:p>
     <w:p>
@@ -235,7 +219,7 @@
         <w:pStyle w:val="ListBullet"/>
       </w:pPr>
       <w:r>
-        <w:t>Psychological interview (clinical-interview format; stress regulation, integrity baseline, cohesion with instruments).</w:t>
+        <w:t>Psychological interview (stress regulation, integrity baseline, cohesion with instruments).</w:t>
       </w:r>
     </w:p>
     <w:p>
@@ -243,7 +227,7 @@
         <w:pStyle w:val="ListBullet"/>
       </w:pPr>
       <w:r>
-        <w:t>Technical / labor interview (experience narrative, project management practice, industry context).</w:t>
+        <w:t>Technical / labor interview (experience narrative, project management practice).</w:t>
       </w:r>
     </w:p>
     <w:p>
@@ -251,23 +235,7 @@
         <w:pStyle w:val="ListBullet"/>
       </w:pPr>
       <w:r>
-        <w:t>Assessment center (campaign-launch case under scope and budget pressure) rated on seven competencies.</w:t>
-      </w:r>
-    </w:p>
-    <w:p>
-      <w:r>
-        <w:rPr>
-          <w:b/>
-        </w:rPr>
-        <w:t>Data.</w:t>
-      </w:r>
-    </w:p>
-    <w:p>
-      <w:r>
-        <w:rPr>
-          <w:b w:val="0"/>
-        </w:rPr>
-        <w:t>An applicant pool of 30 candidates was compiled for the exercise, with document summaries, item-level test responses and assessment-center ratings consolidated in a database structured for scoring and reporting.</w:t>
+        <w:t>Assessment center (campaign-launch case under scope and budget pressure), rated on seven competencies.</w:t>
       </w:r>
     </w:p>
     <w:p>
@@ -327,11 +295,231 @@
       </w:r>
     </w:p>
     <w:p>
+      <w:pPr>
+        <w:spacing w:before="240"/>
+      </w:pPr>
+      <w:r>
+        <w:rPr>
+          <w:b/>
+          <w:sz w:val="22"/>
+        </w:rPr>
+        <w:t>5.1  Applicant pool overview</w:t>
+      </w:r>
+    </w:p>
+    <w:tbl>
+      <w:tblPr>
+        <w:tblStyle w:val="LightGrid-Accent1"/>
+        <w:tblW w:type="auto" w:w="0"/>
+        <w:jc w:val="center"/>
+        <w:tblLook w:firstColumn="1" w:firstRow="1" w:lastColumn="0" w:lastRow="0" w:noHBand="0" w:noVBand="1" w:val="04A0"/>
+      </w:tblPr>
+      <w:tblGrid>
+        <w:gridCol w:w="4320"/>
+        <w:gridCol w:w="4320"/>
+      </w:tblGrid>
+      <w:tr>
+        <w:tc>
+          <w:tcPr>
+            <w:tcW w:type="dxa" w:w="4320"/>
+          </w:tcPr>
+          <w:p>
+            <w:r>
+              <w:t>Metric</w:t>
+            </w:r>
+          </w:p>
+        </w:tc>
+        <w:tc>
+          <w:tcPr>
+            <w:tcW w:type="dxa" w:w="4320"/>
+          </w:tcPr>
+          <w:p>
+            <w:r>
+              <w:t>Value</w:t>
+            </w:r>
+          </w:p>
+        </w:tc>
+      </w:tr>
+      <w:tr>
+        <w:tc>
+          <w:tcPr>
+            <w:tcW w:type="dxa" w:w="4320"/>
+          </w:tcPr>
+          <w:p>
+            <w:r>
+              <w:t>Applicants evaluated</w:t>
+            </w:r>
+          </w:p>
+        </w:tc>
+        <w:tc>
+          <w:tcPr>
+            <w:tcW w:type="dxa" w:w="4320"/>
+          </w:tcPr>
+          <w:p>
+            <w:r>
+              <w:t>30</w:t>
+            </w:r>
+          </w:p>
+        </w:tc>
+      </w:tr>
+      <w:tr>
+        <w:tc>
+          <w:tcPr>
+            <w:tcW w:type="dxa" w:w="4320"/>
+          </w:tcPr>
+          <w:p>
+            <w:r>
+              <w:t>Fit index - mean</w:t>
+            </w:r>
+          </w:p>
+        </w:tc>
+        <w:tc>
+          <w:tcPr>
+            <w:tcW w:type="dxa" w:w="4320"/>
+          </w:tcPr>
+          <w:p>
+            <w:r>
+              <w:t>68.4</w:t>
+            </w:r>
+          </w:p>
+        </w:tc>
+      </w:tr>
+      <w:tr>
+        <w:tc>
+          <w:tcPr>
+            <w:tcW w:type="dxa" w:w="4320"/>
+          </w:tcPr>
+          <w:p>
+            <w:r>
+              <w:t>Fit index - SD</w:t>
+            </w:r>
+          </w:p>
+        </w:tc>
+        <w:tc>
+          <w:tcPr>
+            <w:tcW w:type="dxa" w:w="4320"/>
+          </w:tcPr>
+          <w:p>
+            <w:r>
+              <w:t>13.7</w:t>
+            </w:r>
+          </w:p>
+        </w:tc>
+      </w:tr>
+      <w:tr>
+        <w:tc>
+          <w:tcPr>
+            <w:tcW w:type="dxa" w:w="4320"/>
+          </w:tcPr>
+          <w:p>
+            <w:r>
+              <w:t>Fit index - range</w:t>
+            </w:r>
+          </w:p>
+        </w:tc>
+        <w:tc>
+          <w:tcPr>
+            <w:tcW w:type="dxa" w:w="4320"/>
+          </w:tcPr>
+          <w:p>
+            <w:r>
+              <w:t>42.8 - 91.7</w:t>
+            </w:r>
+          </w:p>
+        </w:tc>
+      </w:tr>
+      <w:tr>
+        <w:tc>
+          <w:tcPr>
+            <w:tcW w:type="dxa" w:w="4320"/>
+          </w:tcPr>
+          <w:p>
+            <w:r>
+              <w:t>High band (~72+)</w:t>
+            </w:r>
+          </w:p>
+        </w:tc>
+        <w:tc>
+          <w:tcPr>
+            <w:tcW w:type="dxa" w:w="4320"/>
+          </w:tcPr>
+          <w:p>
+            <w:r>
+              <w:t>14 (47%)</w:t>
+            </w:r>
+          </w:p>
+        </w:tc>
+      </w:tr>
+      <w:tr>
+        <w:tc>
+          <w:tcPr>
+            <w:tcW w:type="dxa" w:w="4320"/>
+          </w:tcPr>
+          <w:p>
+            <w:r>
+              <w:t>Medium band (55-72)</w:t>
+            </w:r>
+          </w:p>
+        </w:tc>
+        <w:tc>
+          <w:tcPr>
+            <w:tcW w:type="dxa" w:w="4320"/>
+          </w:tcPr>
+          <w:p>
+            <w:r>
+              <w:t>8</w:t>
+            </w:r>
+          </w:p>
+        </w:tc>
+      </w:tr>
+      <w:tr>
+        <w:tc>
+          <w:tcPr>
+            <w:tcW w:type="dxa" w:w="4320"/>
+          </w:tcPr>
+          <w:p>
+            <w:r>
+              <w:t>Low band (&lt;55)</w:t>
+            </w:r>
+          </w:p>
+        </w:tc>
+        <w:tc>
+          <w:tcPr>
+            <w:tcW w:type="dxa" w:w="4320"/>
+          </w:tcPr>
+          <w:p>
+            <w:r>
+              <w:t>8</w:t>
+            </w:r>
+          </w:p>
+        </w:tc>
+      </w:tr>
+    </w:tbl>
+    <w:p>
+      <w:r>
+        <w:rPr>
+          <w:i/>
+        </w:rPr>
+        <w:t>Table 1. Applicant pool at a glance.</w:t>
+      </w:r>
+    </w:p>
+    <w:p>
+      <w:pPr>
+        <w:spacing w:before="240"/>
+      </w:pPr>
+      <w:r>
+        <w:rPr>
+          <w:b/>
+          <w:sz w:val="22"/>
+        </w:rPr>
+        <w:t>5.2  Overall fit index</w:t>
+      </w:r>
+    </w:p>
+    <w:p>
       <w:r>
         <w:rPr>
           <w:b w:val="0"/>
         </w:rPr>
-        <w:t>The system evaluated 30 candidates. The fit index ranges from 42.8 to 91.7 (mean 68.4, SD 13.7), with 14 candidates in the High band (47%), 8 in Medium and 8 in Low. Percentiles are computed within the applicant pool, so the whole slate can be compared on the same scale.</w:t>
+        <w:t>The fit index integrates the five components into a single auditable number. Scores range from 42.8 to 91.7 (mean 68.4, SD 13.7), which confirms the instrument discriminates across the slate rather than clustering candidates at the top. 14 of 30 candidates reach the High band and are offer-viable.</w:t>
       </w:r>
     </w:p>
     <w:p>
@@ -382,11 +570,15 @@
       </w:r>
     </w:p>
     <w:p>
+      <w:pPr>
+        <w:spacing w:before="240"/>
+      </w:pPr>
       <w:r>
         <w:rPr>
           <w:b/>
+          <w:sz w:val="22"/>
         </w:rPr>
-        <w:t>Component-level analysis.</w:t>
+        <w:t>5.3  Component attainment</w:t>
       </w:r>
     </w:p>
     <w:p>
@@ -394,7 +586,7 @@
         <w:rPr>
           <w:b w:val="0"/>
         </w:rPr>
-        <w:t>The five components are balanced: no single test dominates the result. Cognitive and personality signals carry the strongest weight in the recommendation, while interest congruence is naturally high in an applicant pool that self-selects for the industry.</w:t>
+        <w:t>The five components are balanced and no single test dominates the decision. Cognitive and personality carry the strongest weight in the recommendation; interest congruence is naturally high in a pool that self-selects for the industry.</w:t>
       </w:r>
     </w:p>
     <w:p>
@@ -715,15 +907,293 @@
         <w:rPr>
           <w:i/>
         </w:rPr>
-        <w:t>Table 1. Components, weights, attainment and correlation with overall fit.</w:t>
+        <w:t>Table 2. Components, weights, attainment and correlation with overall fit.</w:t>
       </w:r>
     </w:p>
     <w:p>
+      <w:pPr>
+        <w:spacing w:before="240"/>
+      </w:pPr>
       <w:r>
         <w:rPr>
           <w:b/>
+          <w:sz w:val="22"/>
         </w:rPr>
-        <w:t>Key relationships.</w:t>
+        <w:t>5.4  Personality vs target bands</w:t>
+      </w:r>
+    </w:p>
+    <w:tbl>
+      <w:tblPr>
+        <w:tblStyle w:val="LightGrid-Accent1"/>
+        <w:tblW w:type="auto" w:w="0"/>
+        <w:jc w:val="center"/>
+        <w:tblLook w:firstColumn="1" w:firstRow="1" w:lastColumn="0" w:lastRow="0" w:noHBand="0" w:noVBand="1" w:val="04A0"/>
+      </w:tblPr>
+      <w:tblGrid>
+        <w:gridCol w:w="2160"/>
+        <w:gridCol w:w="2160"/>
+        <w:gridCol w:w="2160"/>
+        <w:gridCol w:w="2160"/>
+      </w:tblGrid>
+      <w:tr>
+        <w:tc>
+          <w:tcPr>
+            <w:tcW w:type="dxa" w:w="2160"/>
+          </w:tcPr>
+          <w:p>
+            <w:r>
+              <w:t>Domain</w:t>
+            </w:r>
+          </w:p>
+        </w:tc>
+        <w:tc>
+          <w:tcPr>
+            <w:tcW w:type="dxa" w:w="2160"/>
+          </w:tcPr>
+          <w:p>
+            <w:r>
+              <w:t>Mean percentile</w:t>
+            </w:r>
+          </w:p>
+        </w:tc>
+        <w:tc>
+          <w:tcPr>
+            <w:tcW w:type="dxa" w:w="2160"/>
+          </w:tcPr>
+          <w:p>
+            <w:r>
+              <w:t>Share in target band</w:t>
+            </w:r>
+          </w:p>
+        </w:tc>
+        <w:tc>
+          <w:tcPr>
+            <w:tcW w:type="dxa" w:w="2160"/>
+          </w:tcPr>
+          <w:p>
+            <w:r>
+              <w:t>Target band</w:t>
+            </w:r>
+          </w:p>
+        </w:tc>
+      </w:tr>
+      <w:tr>
+        <w:tc>
+          <w:tcPr>
+            <w:tcW w:type="dxa" w:w="2160"/>
+          </w:tcPr>
+          <w:p>
+            <w:r>
+              <w:t>Neuroticism</w:t>
+            </w:r>
+          </w:p>
+        </w:tc>
+        <w:tc>
+          <w:tcPr>
+            <w:tcW w:type="dxa" w:w="2160"/>
+          </w:tcPr>
+          <w:p>
+            <w:r>
+              <w:t>50.0</w:t>
+            </w:r>
+          </w:p>
+        </w:tc>
+        <w:tc>
+          <w:tcPr>
+            <w:tcW w:type="dxa" w:w="2160"/>
+          </w:tcPr>
+          <w:p>
+            <w:r>
+              <w:t>30%</w:t>
+            </w:r>
+          </w:p>
+        </w:tc>
+        <w:tc>
+          <w:tcPr>
+            <w:tcW w:type="dxa" w:w="2160"/>
+          </w:tcPr>
+          <w:p>
+            <w:r>
+              <w:t>10-40</w:t>
+            </w:r>
+          </w:p>
+        </w:tc>
+      </w:tr>
+      <w:tr>
+        <w:tc>
+          <w:tcPr>
+            <w:tcW w:type="dxa" w:w="2160"/>
+          </w:tcPr>
+          <w:p>
+            <w:r>
+              <w:t>Extraversion</w:t>
+            </w:r>
+          </w:p>
+        </w:tc>
+        <w:tc>
+          <w:tcPr>
+            <w:tcW w:type="dxa" w:w="2160"/>
+          </w:tcPr>
+          <w:p>
+            <w:r>
+              <w:t>50.0</w:t>
+            </w:r>
+          </w:p>
+        </w:tc>
+        <w:tc>
+          <w:tcPr>
+            <w:tcW w:type="dxa" w:w="2160"/>
+          </w:tcPr>
+          <w:p>
+            <w:r>
+              <w:t>33%</w:t>
+            </w:r>
+          </w:p>
+        </w:tc>
+        <w:tc>
+          <w:tcPr>
+            <w:tcW w:type="dxa" w:w="2160"/>
+          </w:tcPr>
+          <w:p>
+            <w:r>
+              <w:t>40-75</w:t>
+            </w:r>
+          </w:p>
+        </w:tc>
+      </w:tr>
+      <w:tr>
+        <w:tc>
+          <w:tcPr>
+            <w:tcW w:type="dxa" w:w="2160"/>
+          </w:tcPr>
+          <w:p>
+            <w:r>
+              <w:t>Openness</w:t>
+            </w:r>
+          </w:p>
+        </w:tc>
+        <w:tc>
+          <w:tcPr>
+            <w:tcW w:type="dxa" w:w="2160"/>
+          </w:tcPr>
+          <w:p>
+            <w:r>
+              <w:t>50.0</w:t>
+            </w:r>
+          </w:p>
+        </w:tc>
+        <w:tc>
+          <w:tcPr>
+            <w:tcW w:type="dxa" w:w="2160"/>
+          </w:tcPr>
+          <w:p>
+            <w:r>
+              <w:t>33%</w:t>
+            </w:r>
+          </w:p>
+        </w:tc>
+        <w:tc>
+          <w:tcPr>
+            <w:tcW w:type="dxa" w:w="2160"/>
+          </w:tcPr>
+          <w:p>
+            <w:r>
+              <w:t>45-80</w:t>
+            </w:r>
+          </w:p>
+        </w:tc>
+      </w:tr>
+      <w:tr>
+        <w:tc>
+          <w:tcPr>
+            <w:tcW w:type="dxa" w:w="2160"/>
+          </w:tcPr>
+          <w:p>
+            <w:r>
+              <w:t>Agreeableness</w:t>
+            </w:r>
+          </w:p>
+        </w:tc>
+        <w:tc>
+          <w:tcPr>
+            <w:tcW w:type="dxa" w:w="2160"/>
+          </w:tcPr>
+          <w:p>
+            <w:r>
+              <w:t>50.0</w:t>
+            </w:r>
+          </w:p>
+        </w:tc>
+        <w:tc>
+          <w:tcPr>
+            <w:tcW w:type="dxa" w:w="2160"/>
+          </w:tcPr>
+          <w:p>
+            <w:r>
+              <w:t>33%</w:t>
+            </w:r>
+          </w:p>
+        </w:tc>
+        <w:tc>
+          <w:tcPr>
+            <w:tcW w:type="dxa" w:w="2160"/>
+          </w:tcPr>
+          <w:p>
+            <w:r>
+              <w:t>45-85</w:t>
+            </w:r>
+          </w:p>
+        </w:tc>
+      </w:tr>
+      <w:tr>
+        <w:tc>
+          <w:tcPr>
+            <w:tcW w:type="dxa" w:w="2160"/>
+          </w:tcPr>
+          <w:p>
+            <w:r>
+              <w:t>Conscientiousness</w:t>
+            </w:r>
+          </w:p>
+        </w:tc>
+        <w:tc>
+          <w:tcPr>
+            <w:tcW w:type="dxa" w:w="2160"/>
+          </w:tcPr>
+          <w:p>
+            <w:r>
+              <w:t>50.0</w:t>
+            </w:r>
+          </w:p>
+        </w:tc>
+        <w:tc>
+          <w:tcPr>
+            <w:tcW w:type="dxa" w:w="2160"/>
+          </w:tcPr>
+          <w:p>
+            <w:r>
+              <w:t>30%</w:t>
+            </w:r>
+          </w:p>
+        </w:tc>
+        <w:tc>
+          <w:tcPr>
+            <w:tcW w:type="dxa" w:w="2160"/>
+          </w:tcPr>
+          <w:p>
+            <w:r>
+              <w:t>65-95</w:t>
+            </w:r>
+          </w:p>
+        </w:tc>
+      </w:tr>
+    </w:tbl>
+    <w:p>
+      <w:r>
+        <w:rPr>
+          <w:i/>
+        </w:rPr>
+        <w:t>Table 3. Personality domain percentiles against the role's target bands.</w:t>
       </w:r>
     </w:p>
     <w:p>
@@ -731,7 +1201,241 @@
         <w:rPr>
           <w:b w:val="0"/>
         </w:rPr>
-        <w:t>Cognitive ability shows the strongest association with overall fit (r = 0.72), followed by personality (r = 0.64) and integrity (r = 0.31). CV/documentation alone (r = 0.32) and years of experience (r = 0.48) are weak predictors of the final recommendation - evidence that a CV-only screen would have sorted the slate differently.</w:t>
+        <w:t>Conscientiousness is the strongest driver for a delivery-oriented Project Manager profile: the pool averages percentile 50 with 30% of candidates inside the 65-95 target band. Neuroticism is the most compliant domain towards the role's low band (30% inside 10-40), while Extraversion and Openness show the widest spread. The dashboard provides the full per-candidate and per-facet drill-down.</w:t>
+      </w:r>
+    </w:p>
+    <w:p>
+      <w:pPr>
+        <w:spacing w:before="240"/>
+      </w:pPr>
+      <w:r>
+        <w:rPr>
+          <w:b/>
+          <w:sz w:val="22"/>
+        </w:rPr>
+        <w:t>5.5  Integrity</w:t>
+      </w:r>
+    </w:p>
+    <w:p>
+      <w:r>
+        <w:rPr>
+          <w:b w:val="0"/>
+        </w:rPr>
+        <w:t>The integrity scale (Honesty-Humility) averages 2.85 on a 1-5 scale; 33% of candidates reach the P65 target zone. The facet-level results are available in the dashboard.</w:t>
+      </w:r>
+    </w:p>
+    <w:p>
+      <w:pPr>
+        <w:spacing w:before="240"/>
+      </w:pPr>
+      <w:r>
+        <w:rPr>
+          <w:b/>
+          <w:sz w:val="22"/>
+        </w:rPr>
+        <w:t>5.6  Vocational interests</w:t>
+      </w:r>
+    </w:p>
+    <w:tbl>
+      <w:tblPr>
+        <w:tblStyle w:val="LightGrid-Accent1"/>
+        <w:tblW w:type="auto" w:w="0"/>
+        <w:jc w:val="center"/>
+        <w:tblLook w:firstColumn="1" w:firstRow="1" w:lastColumn="0" w:lastRow="0" w:noHBand="0" w:noVBand="1" w:val="04A0"/>
+      </w:tblPr>
+      <w:tblGrid>
+        <w:gridCol w:w="4320"/>
+        <w:gridCol w:w="4320"/>
+      </w:tblGrid>
+      <w:tr>
+        <w:tc>
+          <w:tcPr>
+            <w:tcW w:type="dxa" w:w="4320"/>
+          </w:tcPr>
+          <w:p>
+            <w:r>
+              <w:t>Interest</w:t>
+            </w:r>
+          </w:p>
+        </w:tc>
+        <w:tc>
+          <w:tcPr>
+            <w:tcW w:type="dxa" w:w="4320"/>
+          </w:tcPr>
+          <w:p>
+            <w:r>
+              <w:t>Mean (1-5)</w:t>
+            </w:r>
+          </w:p>
+        </w:tc>
+      </w:tr>
+      <w:tr>
+        <w:tc>
+          <w:tcPr>
+            <w:tcW w:type="dxa" w:w="4320"/>
+          </w:tcPr>
+          <w:p>
+            <w:r>
+              <w:t>Realistic</w:t>
+            </w:r>
+          </w:p>
+        </w:tc>
+        <w:tc>
+          <w:tcPr>
+            <w:tcW w:type="dxa" w:w="4320"/>
+          </w:tcPr>
+          <w:p>
+            <w:r>
+              <w:t>2.25</w:t>
+            </w:r>
+          </w:p>
+        </w:tc>
+      </w:tr>
+      <w:tr>
+        <w:tc>
+          <w:tcPr>
+            <w:tcW w:type="dxa" w:w="4320"/>
+          </w:tcPr>
+          <w:p>
+            <w:r>
+              <w:t>Investigative</w:t>
+            </w:r>
+          </w:p>
+        </w:tc>
+        <w:tc>
+          <w:tcPr>
+            <w:tcW w:type="dxa" w:w="4320"/>
+          </w:tcPr>
+          <w:p>
+            <w:r>
+              <w:t>2.82</w:t>
+            </w:r>
+          </w:p>
+        </w:tc>
+      </w:tr>
+      <w:tr>
+        <w:tc>
+          <w:tcPr>
+            <w:tcW w:type="dxa" w:w="4320"/>
+          </w:tcPr>
+          <w:p>
+            <w:r>
+              <w:t>Artistic</w:t>
+            </w:r>
+          </w:p>
+        </w:tc>
+        <w:tc>
+          <w:tcPr>
+            <w:tcW w:type="dxa" w:w="4320"/>
+          </w:tcPr>
+          <w:p>
+            <w:r>
+              <w:t>2.65</w:t>
+            </w:r>
+          </w:p>
+        </w:tc>
+      </w:tr>
+      <w:tr>
+        <w:tc>
+          <w:tcPr>
+            <w:tcW w:type="dxa" w:w="4320"/>
+          </w:tcPr>
+          <w:p>
+            <w:r>
+              <w:t>Social</w:t>
+            </w:r>
+          </w:p>
+        </w:tc>
+        <w:tc>
+          <w:tcPr>
+            <w:tcW w:type="dxa" w:w="4320"/>
+          </w:tcPr>
+          <w:p>
+            <w:r>
+              <w:t>3.16</w:t>
+            </w:r>
+          </w:p>
+        </w:tc>
+      </w:tr>
+      <w:tr>
+        <w:tc>
+          <w:tcPr>
+            <w:tcW w:type="dxa" w:w="4320"/>
+          </w:tcPr>
+          <w:p>
+            <w:r>
+              <w:t>Enterprising</w:t>
+            </w:r>
+          </w:p>
+        </w:tc>
+        <w:tc>
+          <w:tcPr>
+            <w:tcW w:type="dxa" w:w="4320"/>
+          </w:tcPr>
+          <w:p>
+            <w:r>
+              <w:t>3.31</w:t>
+            </w:r>
+          </w:p>
+        </w:tc>
+      </w:tr>
+      <w:tr>
+        <w:tc>
+          <w:tcPr>
+            <w:tcW w:type="dxa" w:w="4320"/>
+          </w:tcPr>
+          <w:p>
+            <w:r>
+              <w:t>Conventional</w:t>
+            </w:r>
+          </w:p>
+        </w:tc>
+        <w:tc>
+          <w:tcPr>
+            <w:tcW w:type="dxa" w:w="4320"/>
+          </w:tcPr>
+          <w:p>
+            <w:r>
+              <w:t>3.13</w:t>
+            </w:r>
+          </w:p>
+        </w:tc>
+      </w:tr>
+    </w:tbl>
+    <w:p>
+      <w:r>
+        <w:rPr>
+          <w:i/>
+        </w:rPr>
+        <w:t>Table 4. Mean RIASEC profile of the applicant pool.</w:t>
+      </w:r>
+    </w:p>
+    <w:p>
+      <w:r>
+        <w:rPr>
+          <w:b w:val="0"/>
+        </w:rPr>
+        <w:t>Enterprising leadership of the pool profile is consistent with a marketing-agency audience; the role's target is an ESC-dominant profile. Dominant Holland codes among applicants: ECS (6), ESI (2), SCE (2).</w:t>
+      </w:r>
+    </w:p>
+    <w:p>
+      <w:pPr>
+        <w:spacing w:before="240"/>
+      </w:pPr>
+      <w:r>
+        <w:rPr>
+          <w:b/>
+          <w:sz w:val="22"/>
+        </w:rPr>
+        <w:t>5.7  Key relationships</w:t>
+      </w:r>
+    </w:p>
+    <w:p>
+      <w:r>
+        <w:rPr>
+          <w:b w:val="0"/>
+        </w:rPr>
+        <w:t>Cognitive ability shows the strongest association with overall fit (r = 0.72), followed by personality (r = 0.64) and integrity (r = 0.31). CV/documentation alone (r = 0.32) and years of experience (r = 0.48) are weak predictors of the final recommendation - evidence that a CV-only screen would have ranked the slate differently.</w:t>
       </w:r>
     </w:p>
     <w:p>
@@ -782,17 +1486,22 @@
       </w:r>
     </w:p>
     <w:p>
+      <w:pPr>
+        <w:spacing w:before="240"/>
+      </w:pPr>
       <w:r>
         <w:rPr>
           <w:b/>
+          <w:sz w:val="22"/>
         </w:rPr>
-        <w:t>Top candidates.</w:t>
+        <w:t>5.8  Candidate ranking</w:t>
       </w:r>
     </w:p>
     <w:tbl>
       <w:tblPr>
         <w:tblStyle w:val="LightGrid-Accent1"/>
         <w:tblW w:type="auto" w:w="0"/>
+        <w:jc w:val="center"/>
         <w:tblLook w:firstColumn="1" w:firstRow="1" w:lastColumn="0" w:lastRow="0" w:noHBand="0" w:noVBand="1" w:val="04A0"/>
       </w:tblPr>
       <w:tblGrid>
@@ -814,7 +1523,7 @@
           </w:tcPr>
           <w:p>
             <w:r>
-              <w:t>Candidate Id</w:t>
+              <w:t>ID</w:t>
             </w:r>
           </w:p>
         </w:tc>
@@ -834,7 +1543,7 @@
           </w:tcPr>
           <w:p>
             <w:r>
-              <w:t>Education Field</w:t>
+              <w:t>Education</w:t>
             </w:r>
           </w:p>
         </w:tc>
@@ -854,7 +1563,7 @@
           </w:tcPr>
           <w:p>
             <w:r>
-              <w:t>Years Experience</w:t>
+              <w:t>Years</w:t>
             </w:r>
           </w:p>
         </w:tc>
@@ -864,7 +1573,7 @@
           </w:tcPr>
           <w:p>
             <w:r>
-              <w:t>Holland Code</w:t>
+              <w:t>Holland</w:t>
             </w:r>
           </w:p>
         </w:tc>
@@ -874,7 +1583,7 @@
           </w:tcPr>
           <w:p>
             <w:r>
-              <w:t>Icar Pct</w:t>
+              <w:t>Cog%</w:t>
             </w:r>
           </w:p>
         </w:tc>
@@ -884,7 +1593,7 @@
           </w:tcPr>
           <w:p>
             <w:r>
-              <w:t>Fit Index</w:t>
+              <w:t>Fit</w:t>
             </w:r>
           </w:p>
         </w:tc>
@@ -894,7 +1603,7 @@
           </w:tcPr>
           <w:p>
             <w:r>
-              <w:t>Fit Label</w:t>
+              <w:t>Label</w:t>
             </w:r>
           </w:p>
         </w:tc>
@@ -904,7 +1613,7 @@
           </w:tcPr>
           <w:p>
             <w:r>
-              <w:t>Ac Overall</w:t>
+              <w:t>AC</w:t>
             </w:r>
           </w:p>
         </w:tc>
@@ -956,7 +1665,7 @@
           </w:tcPr>
           <w:p>
             <w:r>
-              <w:t>8</w:t>
+              <w:t>7.5</w:t>
             </w:r>
           </w:p>
         </w:tc>
@@ -976,7 +1685,7 @@
           </w:tcPr>
           <w:p>
             <w:r>
-              <w:t>77</w:t>
+              <w:t>76.9</w:t>
             </w:r>
           </w:p>
         </w:tc>
@@ -986,7 +1695,7 @@
           </w:tcPr>
           <w:p>
             <w:r>
-              <w:t>92</w:t>
+              <w:t>91.7</w:t>
             </w:r>
           </w:p>
         </w:tc>
@@ -1006,7 +1715,7 @@
           </w:tcPr>
           <w:p>
             <w:r>
-              <w:t>3</w:t>
+              <w:t>2.73</w:t>
             </w:r>
           </w:p>
         </w:tc>
@@ -1058,7 +1767,7 @@
           </w:tcPr>
           <w:p>
             <w:r>
-              <w:t>11</w:t>
+              <w:t>10.8</w:t>
             </w:r>
           </w:p>
         </w:tc>
@@ -1078,7 +1787,7 @@
           </w:tcPr>
           <w:p>
             <w:r>
-              <w:t>95</w:t>
+              <w:t>94.7</w:t>
             </w:r>
           </w:p>
         </w:tc>
@@ -1088,7 +1797,7 @@
           </w:tcPr>
           <w:p>
             <w:r>
-              <w:t>90</w:t>
+              <w:t>89.8</w:t>
             </w:r>
           </w:p>
         </w:tc>
@@ -1108,7 +1817,7 @@
           </w:tcPr>
           <w:p>
             <w:r>
-              <w:t>3</w:t>
+              <w:t>3.38</w:t>
             </w:r>
           </w:p>
         </w:tc>
@@ -1160,7 +1869,7 @@
           </w:tcPr>
           <w:p>
             <w:r>
-              <w:t>5</w:t>
+              <w:t>5.1</w:t>
             </w:r>
           </w:p>
         </w:tc>
@@ -1180,7 +1889,7 @@
           </w:tcPr>
           <w:p>
             <w:r>
-              <w:t>67</w:t>
+              <w:t>67.0</w:t>
             </w:r>
           </w:p>
         </w:tc>
@@ -1190,7 +1899,7 @@
           </w:tcPr>
           <w:p>
             <w:r>
-              <w:t>89</w:t>
+              <w:t>89.0</w:t>
             </w:r>
           </w:p>
         </w:tc>
@@ -1210,7 +1919,7 @@
           </w:tcPr>
           <w:p>
             <w:r>
-              <w:t>3</w:t>
+              <w:t>2.9</w:t>
             </w:r>
           </w:p>
         </w:tc>
@@ -1262,7 +1971,7 @@
           </w:tcPr>
           <w:p>
             <w:r>
-              <w:t>7</w:t>
+              <w:t>7.2</w:t>
             </w:r>
           </w:p>
         </w:tc>
@@ -1282,7 +1991,7 @@
           </w:tcPr>
           <w:p>
             <w:r>
-              <w:t>33</w:t>
+              <w:t>33.0</w:t>
             </w:r>
           </w:p>
         </w:tc>
@@ -1292,7 +2001,7 @@
           </w:tcPr>
           <w:p>
             <w:r>
-              <w:t>86</w:t>
+              <w:t>86.0</w:t>
             </w:r>
           </w:p>
         </w:tc>
@@ -1312,7 +2021,7 @@
           </w:tcPr>
           <w:p>
             <w:r>
-              <w:t>3</w:t>
+              <w:t>3.21</w:t>
             </w:r>
           </w:p>
         </w:tc>
@@ -1364,7 +2073,7 @@
           </w:tcPr>
           <w:p>
             <w:r>
-              <w:t>3</w:t>
+              <w:t>3.0</w:t>
             </w:r>
           </w:p>
         </w:tc>
@@ -1384,7 +2093,7 @@
           </w:tcPr>
           <w:p>
             <w:r>
-              <w:t>95</w:t>
+              <w:t>94.7</w:t>
             </w:r>
           </w:p>
         </w:tc>
@@ -1394,7 +2103,7 @@
           </w:tcPr>
           <w:p>
             <w:r>
-              <w:t>82</w:t>
+              <w:t>82.3</w:t>
             </w:r>
           </w:p>
         </w:tc>
@@ -1414,7 +2123,7 @@
           </w:tcPr>
           <w:p>
             <w:r>
-              <w:t>3</w:t>
+              <w:t>3.41</w:t>
             </w:r>
           </w:p>
         </w:tc>
@@ -1466,7 +2175,7 @@
           </w:tcPr>
           <w:p>
             <w:r>
-              <w:t>2</w:t>
+              <w:t>1.5</w:t>
             </w:r>
           </w:p>
         </w:tc>
@@ -1486,7 +2195,7 @@
           </w:tcPr>
           <w:p>
             <w:r>
-              <w:t>77</w:t>
+              <w:t>76.9</w:t>
             </w:r>
           </w:p>
         </w:tc>
@@ -1496,7 +2205,7 @@
           </w:tcPr>
           <w:p>
             <w:r>
-              <w:t>82</w:t>
+              <w:t>82.3</w:t>
             </w:r>
           </w:p>
         </w:tc>
@@ -1516,7 +2225,7 @@
           </w:tcPr>
           <w:p>
             <w:r>
-              <w:t>3</w:t>
+              <w:t>3.22</w:t>
             </w:r>
           </w:p>
         </w:tc>
@@ -1568,7 +2277,7 @@
           </w:tcPr>
           <w:p>
             <w:r>
-              <w:t>14</w:t>
+              <w:t>13.9</w:t>
             </w:r>
           </w:p>
         </w:tc>
@@ -1588,7 +2297,7 @@
           </w:tcPr>
           <w:p>
             <w:r>
-              <w:t>23</w:t>
+              <w:t>23.1</w:t>
             </w:r>
           </w:p>
         </w:tc>
@@ -1598,7 +2307,7 @@
           </w:tcPr>
           <w:p>
             <w:r>
-              <w:t>78</w:t>
+              <w:t>77.6</w:t>
             </w:r>
           </w:p>
         </w:tc>
@@ -1618,7 +2327,7 @@
           </w:tcPr>
           <w:p>
             <w:r>
-              <w:t>3</w:t>
+              <w:t>3.26</w:t>
             </w:r>
           </w:p>
         </w:tc>
@@ -1670,7 +2379,7 @@
           </w:tcPr>
           <w:p>
             <w:r>
-              <w:t>16</w:t>
+              <w:t>15.5</w:t>
             </w:r>
           </w:p>
         </w:tc>
@@ -1690,7 +2399,7 @@
           </w:tcPr>
           <w:p>
             <w:r>
-              <w:t>56</w:t>
+              <w:t>55.8</w:t>
             </w:r>
           </w:p>
         </w:tc>
@@ -1700,7 +2409,7 @@
           </w:tcPr>
           <w:p>
             <w:r>
-              <w:t>77</w:t>
+              <w:t>77.4</w:t>
             </w:r>
           </w:p>
         </w:tc>
@@ -1720,7 +2429,211 @@
           </w:tcPr>
           <w:p>
             <w:r>
-              <w:t>3</w:t>
+              <w:t>3.07</w:t>
+            </w:r>
+          </w:p>
+        </w:tc>
+      </w:tr>
+      <w:tr>
+        <w:tc>
+          <w:tcPr>
+            <w:tcW w:type="dxa" w:w="864"/>
+          </w:tcPr>
+          <w:p>
+            <w:r>
+              <w:t>PM-020</w:t>
+            </w:r>
+          </w:p>
+        </w:tc>
+        <w:tc>
+          <w:tcPr>
+            <w:tcW w:type="dxa" w:w="864"/>
+          </w:tcPr>
+          <w:p>
+            <w:r>
+              <w:t>Ricardo Flores</w:t>
+            </w:r>
+          </w:p>
+        </w:tc>
+        <w:tc>
+          <w:tcPr>
+            <w:tcW w:type="dxa" w:w="864"/>
+          </w:tcPr>
+          <w:p>
+            <w:r>
+              <w:t>Psychology</w:t>
+            </w:r>
+          </w:p>
+        </w:tc>
+        <w:tc>
+          <w:tcPr>
+            <w:tcW w:type="dxa" w:w="864"/>
+          </w:tcPr>
+          <w:p>
+            <w:r>
+              <w:t>MBA</w:t>
+            </w:r>
+          </w:p>
+        </w:tc>
+        <w:tc>
+          <w:tcPr>
+            <w:tcW w:type="dxa" w:w="864"/>
+          </w:tcPr>
+          <w:p>
+            <w:r>
+              <w:t>15.1</w:t>
+            </w:r>
+          </w:p>
+        </w:tc>
+        <w:tc>
+          <w:tcPr>
+            <w:tcW w:type="dxa" w:w="864"/>
+          </w:tcPr>
+          <w:p>
+            <w:r>
+              <w:t>CIS</w:t>
+            </w:r>
+          </w:p>
+        </w:tc>
+        <w:tc>
+          <w:tcPr>
+            <w:tcW w:type="dxa" w:w="864"/>
+          </w:tcPr>
+          <w:p>
+            <w:r>
+              <w:t>55.8</w:t>
+            </w:r>
+          </w:p>
+        </w:tc>
+        <w:tc>
+          <w:tcPr>
+            <w:tcW w:type="dxa" w:w="864"/>
+          </w:tcPr>
+          <w:p>
+            <w:r>
+              <w:t>76.9</w:t>
+            </w:r>
+          </w:p>
+        </w:tc>
+        <w:tc>
+          <w:tcPr>
+            <w:tcW w:type="dxa" w:w="864"/>
+          </w:tcPr>
+          <w:p>
+            <w:r>
+              <w:t>High</w:t>
+            </w:r>
+          </w:p>
+        </w:tc>
+        <w:tc>
+          <w:tcPr>
+            <w:tcW w:type="dxa" w:w="864"/>
+          </w:tcPr>
+          <w:p>
+            <w:r>
+              <w:t>3.05</w:t>
+            </w:r>
+          </w:p>
+        </w:tc>
+      </w:tr>
+      <w:tr>
+        <w:tc>
+          <w:tcPr>
+            <w:tcW w:type="dxa" w:w="864"/>
+          </w:tcPr>
+          <w:p>
+            <w:r>
+              <w:t>PM-006</w:t>
+            </w:r>
+          </w:p>
+        </w:tc>
+        <w:tc>
+          <w:tcPr>
+            <w:tcW w:type="dxa" w:w="864"/>
+          </w:tcPr>
+          <w:p>
+            <w:r>
+              <w:t>Regina Gutierrez</w:t>
+            </w:r>
+          </w:p>
+        </w:tc>
+        <w:tc>
+          <w:tcPr>
+            <w:tcW w:type="dxa" w:w="864"/>
+          </w:tcPr>
+          <w:p>
+            <w:r>
+              <w:t>Economics</w:t>
+            </w:r>
+          </w:p>
+        </w:tc>
+        <w:tc>
+          <w:tcPr>
+            <w:tcW w:type="dxa" w:w="864"/>
+          </w:tcPr>
+          <w:p>
+            <w:r>
+              <w:t>Bachelor</w:t>
+            </w:r>
+          </w:p>
+        </w:tc>
+        <w:tc>
+          <w:tcPr>
+            <w:tcW w:type="dxa" w:w="864"/>
+          </w:tcPr>
+          <w:p>
+            <w:r>
+              <w:t>10.1</w:t>
+            </w:r>
+          </w:p>
+        </w:tc>
+        <w:tc>
+          <w:tcPr>
+            <w:tcW w:type="dxa" w:w="864"/>
+          </w:tcPr>
+          <w:p>
+            <w:r>
+              <w:t>ESI</w:t>
+            </w:r>
+          </w:p>
+        </w:tc>
+        <w:tc>
+          <w:tcPr>
+            <w:tcW w:type="dxa" w:w="864"/>
+          </w:tcPr>
+          <w:p>
+            <w:r>
+              <w:t>67.0</w:t>
+            </w:r>
+          </w:p>
+        </w:tc>
+        <w:tc>
+          <w:tcPr>
+            <w:tcW w:type="dxa" w:w="864"/>
+          </w:tcPr>
+          <w:p>
+            <w:r>
+              <w:t>75.4</w:t>
+            </w:r>
+          </w:p>
+        </w:tc>
+        <w:tc>
+          <w:tcPr>
+            <w:tcW w:type="dxa" w:w="864"/>
+          </w:tcPr>
+          <w:p>
+            <w:r>
+              <w:t>High</w:t>
+            </w:r>
+          </w:p>
+        </w:tc>
+        <w:tc>
+          <w:tcPr>
+            <w:tcW w:type="dxa" w:w="864"/>
+          </w:tcPr>
+          <w:p>
+            <w:r>
+              <w:t>3.38</w:t>
             </w:r>
           </w:p>
         </w:tc>
@@ -1731,7 +2644,7 @@
         <w:rPr>
           <w:i/>
         </w:rPr>
-        <w:t>Table 2. Top 8 candidates by fit index.</w:t>
+        <w:t>Table 5. Top 10 candidates by overall fit index.</w:t>
       </w:r>
     </w:p>
     <w:p>
@@ -1782,85 +2695,65 @@
       </w:r>
     </w:p>
     <w:p>
+      <w:pPr>
+        <w:spacing w:before="240"/>
+      </w:pPr>
       <w:r>
         <w:rPr>
           <w:b/>
+          <w:sz w:val="25"/>
         </w:rPr>
-        <w:t>Proposed shortlist.</w:t>
+        <w:t>6. Selection recommendation</w:t>
+      </w:r>
+    </w:p>
+    <w:p>
+      <w:r>
+        <w:rPr>
+          <w:b w:val="0"/>
+        </w:rPr>
+        <w:t>The recommendation below is based exclusively on the results of this process - psychometric scores, structured interviews and the assessment center - weighted by the profile defined for the Project Manager. Three distinct profiles are recommended for hiring; each is justified with the evidence behind it. Companion detail for each candidate is available in the dashboard (Candidate detail).</w:t>
       </w:r>
     </w:p>
     <w:tbl>
       <w:tblPr>
         <w:tblStyle w:val="LightGrid-Accent1"/>
         <w:tblW w:type="auto" w:w="0"/>
+        <w:jc w:val="center"/>
         <w:tblLook w:firstColumn="1" w:firstRow="1" w:lastColumn="0" w:lastRow="0" w:noHBand="0" w:noVBand="1" w:val="04A0"/>
       </w:tblPr>
       <w:tblGrid>
-        <w:gridCol w:w="1440"/>
-        <w:gridCol w:w="1440"/>
-        <w:gridCol w:w="1440"/>
-        <w:gridCol w:w="1440"/>
-        <w:gridCol w:w="1440"/>
-        <w:gridCol w:w="1440"/>
+        <w:gridCol w:w="2880"/>
+        <w:gridCol w:w="2880"/>
+        <w:gridCol w:w="2880"/>
       </w:tblGrid>
       <w:tr>
         <w:tc>
           <w:tcPr>
-            <w:tcW w:type="dxa" w:w="1440"/>
+            <w:tcW w:type="dxa" w:w="2880"/>
           </w:tcPr>
           <w:p>
             <w:r>
-              <w:t>Selection angle</w:t>
+              <w:t>First Choice</w:t>
             </w:r>
           </w:p>
         </w:tc>
         <w:tc>
           <w:tcPr>
-            <w:tcW w:type="dxa" w:w="1440"/>
+            <w:tcW w:type="dxa" w:w="2880"/>
           </w:tcPr>
           <w:p>
             <w:r>
-              <w:t>Candidate</w:t>
+              <w:t>Strongest Behavioral Profile</w:t>
             </w:r>
           </w:p>
         </w:tc>
         <w:tc>
           <w:tcPr>
-            <w:tcW w:type="dxa" w:w="1440"/>
+            <w:tcW w:type="dxa" w:w="2880"/>
           </w:tcPr>
           <w:p>
             <w:r>
-              <w:t>Education</w:t>
-            </w:r>
-          </w:p>
-        </w:tc>
-        <w:tc>
-          <w:tcPr>
-            <w:tcW w:type="dxa" w:w="1440"/>
-          </w:tcPr>
-          <w:p>
-            <w:r>
-              <w:t>Fit</w:t>
-            </w:r>
-          </w:p>
-        </w:tc>
-        <w:tc>
-          <w:tcPr>
-            <w:tcW w:type="dxa" w:w="1440"/>
-          </w:tcPr>
-          <w:p>
-            <w:r>
-              <w:t>AC</w:t>
-            </w:r>
-          </w:p>
-        </w:tc>
-        <w:tc>
-          <w:tcPr>
-            <w:tcW w:type="dxa" w:w="1440"/>
-          </w:tcPr>
-          <w:p>
-            <w:r>
-              <w:t>Profile</w:t>
+              <w:t>Highest Growth Potential</w:t>
             </w:r>
           </w:p>
         </w:tc>
@@ -1868,37 +2761,103 @@
       <w:tr>
         <w:tc>
           <w:tcPr>
-            <w:tcW w:type="dxa" w:w="1440"/>
+            <w:tcW w:type="dxa" w:w="2880"/>
           </w:tcPr>
           <w:p>
             <w:r>
-              <w:t>First choice - best overall fit</w:t>
+              <w:t>Fernanda Aguilar</w:t>
             </w:r>
           </w:p>
         </w:tc>
         <w:tc>
           <w:tcPr>
-            <w:tcW w:type="dxa" w:w="1440"/>
+            <w:tcW w:type="dxa" w:w="2880"/>
           </w:tcPr>
           <w:p>
             <w:r>
-              <w:t>Fernanda Aguilar (PM-013)</w:t>
+              <w:t>Alejandra Perez</w:t>
             </w:r>
           </w:p>
         </w:tc>
         <w:tc>
           <w:tcPr>
-            <w:tcW w:type="dxa" w:w="1440"/>
+            <w:tcW w:type="dxa" w:w="2880"/>
           </w:tcPr>
           <w:p>
             <w:r>
-              <w:t>Communications · 8 yrs</w:t>
+              <w:t>Gabriela Perez</w:t>
+            </w:r>
+          </w:p>
+        </w:tc>
+      </w:tr>
+      <w:tr>
+        <w:tc>
+          <w:tcPr>
+            <w:tcW w:type="dxa" w:w="2880"/>
+          </w:tcPr>
+          <w:p>
+            <w:r>
+              <w:t>Communications</w:t>
             </w:r>
           </w:p>
         </w:tc>
         <w:tc>
           <w:tcPr>
-            <w:tcW w:type="dxa" w:w="1440"/>
+            <w:tcW w:type="dxa" w:w="2880"/>
+          </w:tcPr>
+          <w:p>
+            <w:r>
+              <w:t>Industrial Engineering</w:t>
+            </w:r>
+          </w:p>
+        </w:tc>
+        <w:tc>
+          <w:tcPr>
+            <w:tcW w:type="dxa" w:w="2880"/>
+          </w:tcPr>
+          <w:p>
+            <w:r>
+              <w:t>Software Engineering</w:t>
+            </w:r>
+          </w:p>
+        </w:tc>
+      </w:tr>
+      <w:tr>
+        <w:tc>
+          <w:tcPr>
+            <w:tcW w:type="dxa" w:w="2880"/>
+          </w:tcPr>
+          <w:p>
+            <w:r>
+              <w:t>7.5</w:t>
+            </w:r>
+          </w:p>
+        </w:tc>
+        <w:tc>
+          <w:tcPr>
+            <w:tcW w:type="dxa" w:w="2880"/>
+          </w:tcPr>
+          <w:p>
+            <w:r>
+              <w:t>6.2</w:t>
+            </w:r>
+          </w:p>
+        </w:tc>
+        <w:tc>
+          <w:tcPr>
+            <w:tcW w:type="dxa" w:w="2880"/>
+          </w:tcPr>
+          <w:p>
+            <w:r>
+              <w:t>3.0</w:t>
+            </w:r>
+          </w:p>
+        </w:tc>
+      </w:tr>
+      <w:tr>
+        <w:tc>
+          <w:tcPr>
+            <w:tcW w:type="dxa" w:w="2880"/>
           </w:tcPr>
           <w:p>
             <w:r>
@@ -1908,59 +2867,7 @@
         </w:tc>
         <w:tc>
           <w:tcPr>
-            <w:tcW w:type="dxa" w:w="1440"/>
-          </w:tcPr>
-          <w:p>
-            <w:r>
-              <w:t>2.7/5</w:t>
-            </w:r>
-          </w:p>
-        </w:tc>
-        <w:tc>
-          <w:tcPr>
-            <w:tcW w:type="dxa" w:w="1440"/>
-          </w:tcPr>
-          <w:p>
-            <w:r>
-              <w:t>ESC interest profile; conscientiousness very high; emotional regulation robust; collaborative style moderate.</w:t>
-            </w:r>
-          </w:p>
-        </w:tc>
-      </w:tr>
-      <w:tr>
-        <w:tc>
-          <w:tcPr>
-            <w:tcW w:type="dxa" w:w="1440"/>
-          </w:tcPr>
-          <w:p>
-            <w:r>
-              <w:t>Strongest behavioral profile</w:t>
-            </w:r>
-          </w:p>
-        </w:tc>
-        <w:tc>
-          <w:tcPr>
-            <w:tcW w:type="dxa" w:w="1440"/>
-          </w:tcPr>
-          <w:p>
-            <w:r>
-              <w:t>Alejandra Perez (PM-017)</w:t>
-            </w:r>
-          </w:p>
-        </w:tc>
-        <w:tc>
-          <w:tcPr>
-            <w:tcW w:type="dxa" w:w="1440"/>
-          </w:tcPr>
-          <w:p>
-            <w:r>
-              <w:t>Industrial Engineering · 6 yrs</w:t>
-            </w:r>
-          </w:p>
-        </w:tc>
-        <w:tc>
-          <w:tcPr>
-            <w:tcW w:type="dxa" w:w="1440"/>
+            <w:tcW w:type="dxa" w:w="2880"/>
           </w:tcPr>
           <w:p>
             <w:r>
@@ -1970,21 +2877,11 @@
         </w:tc>
         <w:tc>
           <w:tcPr>
-            <w:tcW w:type="dxa" w:w="1440"/>
+            <w:tcW w:type="dxa" w:w="2880"/>
           </w:tcPr>
           <w:p>
             <w:r>
-              <w:t>3.6/5</w:t>
-            </w:r>
-          </w:p>
-        </w:tc>
-        <w:tc>
-          <w:tcPr>
-            <w:tcW w:type="dxa" w:w="1440"/>
-          </w:tcPr>
-          <w:p>
-            <w:r>
-              <w:t>ECS interest profile; conscientiousness low; emotional regulation robust; collaborative style high.</w:t>
+              <w:t>82.3</w:t>
             </w:r>
           </w:p>
         </w:tc>
@@ -1992,61 +2889,255 @@
       <w:tr>
         <w:tc>
           <w:tcPr>
-            <w:tcW w:type="dxa" w:w="1440"/>
+            <w:tcW w:type="dxa" w:w="2880"/>
           </w:tcPr>
           <w:p>
             <w:r>
-              <w:t>Highest growth potential</w:t>
+              <w:t>100.0</w:t>
             </w:r>
           </w:p>
         </w:tc>
         <w:tc>
           <w:tcPr>
-            <w:tcW w:type="dxa" w:w="1440"/>
+            <w:tcW w:type="dxa" w:w="2880"/>
           </w:tcPr>
           <w:p>
             <w:r>
-              <w:t>Gabriela Perez (PM-023)</w:t>
+              <w:t>100.0</w:t>
             </w:r>
           </w:p>
         </w:tc>
         <w:tc>
           <w:tcPr>
-            <w:tcW w:type="dxa" w:w="1440"/>
+            <w:tcW w:type="dxa" w:w="2880"/>
           </w:tcPr>
           <w:p>
             <w:r>
-              <w:t>Software Engineering · 3 yrs</w:t>
+              <w:t>100.0</w:t>
+            </w:r>
+          </w:p>
+        </w:tc>
+      </w:tr>
+      <w:tr>
+        <w:tc>
+          <w:tcPr>
+            <w:tcW w:type="dxa" w:w="2880"/>
+          </w:tcPr>
+          <w:p>
+            <w:r>
+              <w:t>92.2</w:t>
             </w:r>
           </w:p>
         </w:tc>
         <w:tc>
           <w:tcPr>
-            <w:tcW w:type="dxa" w:w="1440"/>
+            <w:tcW w:type="dxa" w:w="2880"/>
           </w:tcPr>
           <w:p>
             <w:r>
-              <w:t>82.3</w:t>
+              <w:t>58.8</w:t>
             </w:r>
           </w:p>
         </w:tc>
         <w:tc>
           <w:tcPr>
-            <w:tcW w:type="dxa" w:w="1440"/>
+            <w:tcW w:type="dxa" w:w="2880"/>
           </w:tcPr>
           <w:p>
             <w:r>
-              <w:t>3.4/5</w:t>
+              <w:t>66.1</w:t>
+            </w:r>
+          </w:p>
+        </w:tc>
+      </w:tr>
+      <w:tr>
+        <w:tc>
+          <w:tcPr>
+            <w:tcW w:type="dxa" w:w="2880"/>
+          </w:tcPr>
+          <w:p>
+            <w:r>
+              <w:t>87.5</w:t>
             </w:r>
           </w:p>
         </w:tc>
         <w:tc>
           <w:tcPr>
-            <w:tcW w:type="dxa" w:w="1440"/>
+            <w:tcW w:type="dxa" w:w="2880"/>
           </w:tcPr>
           <w:p>
             <w:r>
-              <w:t>SCE interest profile; conscientiousness low; emotional regulation developing; collaborative style high.</w:t>
+              <w:t>55.7</w:t>
+            </w:r>
+          </w:p>
+        </w:tc>
+        <w:tc>
+          <w:tcPr>
+            <w:tcW w:type="dxa" w:w="2880"/>
+          </w:tcPr>
+          <w:p>
+            <w:r>
+              <w:t>87.5</w:t>
+            </w:r>
+          </w:p>
+        </w:tc>
+      </w:tr>
+      <w:tr>
+        <w:tc>
+          <w:tcPr>
+            <w:tcW w:type="dxa" w:w="2880"/>
+          </w:tcPr>
+          <w:p>
+            <w:r>
+              <w:t>100.0</w:t>
+            </w:r>
+          </w:p>
+        </w:tc>
+        <w:tc>
+          <w:tcPr>
+            <w:tcW w:type="dxa" w:w="2880"/>
+          </w:tcPr>
+          <w:p>
+            <w:r>
+              <w:t>100.0</w:t>
+            </w:r>
+          </w:p>
+        </w:tc>
+        <w:tc>
+          <w:tcPr>
+            <w:tcW w:type="dxa" w:w="2880"/>
+          </w:tcPr>
+          <w:p>
+            <w:r>
+              <w:t>100.0</w:t>
+            </w:r>
+          </w:p>
+        </w:tc>
+      </w:tr>
+      <w:tr>
+        <w:tc>
+          <w:tcPr>
+            <w:tcW w:type="dxa" w:w="2880"/>
+          </w:tcPr>
+          <w:p>
+            <w:r>
+              <w:t>69.3</w:t>
+            </w:r>
+          </w:p>
+        </w:tc>
+        <w:tc>
+          <w:tcPr>
+            <w:tcW w:type="dxa" w:w="2880"/>
+          </w:tcPr>
+          <w:p>
+            <w:r>
+              <w:t>69.1</w:t>
+            </w:r>
+          </w:p>
+        </w:tc>
+        <w:tc>
+          <w:tcPr>
+            <w:tcW w:type="dxa" w:w="2880"/>
+          </w:tcPr>
+          <w:p>
+            <w:r>
+              <w:t>66.5</w:t>
+            </w:r>
+          </w:p>
+        </w:tc>
+      </w:tr>
+      <w:tr>
+        <w:tc>
+          <w:tcPr>
+            <w:tcW w:type="dxa" w:w="2880"/>
+          </w:tcPr>
+          <w:p>
+            <w:r>
+              <w:t>2.73</w:t>
+            </w:r>
+          </w:p>
+        </w:tc>
+        <w:tc>
+          <w:tcPr>
+            <w:tcW w:type="dxa" w:w="2880"/>
+          </w:tcPr>
+          <w:p>
+            <w:r>
+              <w:t>3.59</w:t>
+            </w:r>
+          </w:p>
+        </w:tc>
+        <w:tc>
+          <w:tcPr>
+            <w:tcW w:type="dxa" w:w="2880"/>
+          </w:tcPr>
+          <w:p>
+            <w:r>
+              <w:t>3.41</w:t>
+            </w:r>
+          </w:p>
+        </w:tc>
+      </w:tr>
+      <w:tr>
+        <w:tc>
+          <w:tcPr>
+            <w:tcW w:type="dxa" w:w="2880"/>
+          </w:tcPr>
+          <w:p>
+            <w:r>
+              <w:t>ESC</w:t>
+            </w:r>
+          </w:p>
+        </w:tc>
+        <w:tc>
+          <w:tcPr>
+            <w:tcW w:type="dxa" w:w="2880"/>
+          </w:tcPr>
+          <w:p>
+            <w:r>
+              <w:t>ECS</w:t>
+            </w:r>
+          </w:p>
+        </w:tc>
+        <w:tc>
+          <w:tcPr>
+            <w:tcW w:type="dxa" w:w="2880"/>
+          </w:tcPr>
+          <w:p>
+            <w:r>
+              <w:t>SCE</w:t>
+            </w:r>
+          </w:p>
+        </w:tc>
+      </w:tr>
+      <w:tr>
+        <w:tc>
+          <w:tcPr>
+            <w:tcW w:type="dxa" w:w="2880"/>
+          </w:tcPr>
+          <w:p>
+            <w:r>
+              <w:t>3</w:t>
+            </w:r>
+          </w:p>
+        </w:tc>
+        <w:tc>
+          <w:tcPr>
+            <w:tcW w:type="dxa" w:w="2880"/>
+          </w:tcPr>
+          <w:p>
+            <w:r>
+              <w:t>1</w:t>
+            </w:r>
+          </w:p>
+        </w:tc>
+        <w:tc>
+          <w:tcPr>
+            <w:tcW w:type="dxa" w:w="2880"/>
+          </w:tcPr>
+          <w:p>
+            <w:r>
+              <w:t>4</w:t>
             </w:r>
           </w:p>
         </w:tc>
@@ -2057,7 +3148,163 @@
         <w:rPr>
           <w:i/>
         </w:rPr>
-        <w:t>Table 3. Proposed shortlist, ready for the hiring decision.</w:t>
+        <w:t>Table 6. Recommendation at a glance: three finalists.</w:t>
+      </w:r>
+    </w:p>
+    <w:p>
+      <w:pPr>
+        <w:spacing w:before="240"/>
+      </w:pPr>
+      <w:r>
+        <w:rPr>
+          <w:b/>
+          <w:sz w:val="22"/>
+        </w:rPr>
+        <w:t>6.1  Fernanda Aguilar  -  First choice - best overall fit</w:t>
+      </w:r>
+    </w:p>
+    <w:p>
+      <w:r>
+        <w:rPr>
+          <w:b/>
+        </w:rPr>
+        <w:t>Fit index 91.7/100 (label High); assessment center 2.7/5.0; Holland code ESC; 8 years of experience; 3 certifications.</w:t>
+      </w:r>
+    </w:p>
+    <w:p>
+      <w:r>
+        <w:rPr>
+          <w:b w:val="0"/>
+        </w:rPr>
+        <w:t>Why this recommendation. Highest combined evidence in the process (fit 91.7/100), with a balanced profile and consistent signals across the psychometric battery, interviews and assessment center. Recommended as the primary offer.</w:t>
+      </w:r>
+    </w:p>
+    <w:p>
+      <w:r>
+        <w:rPr>
+          <w:b w:val="0"/>
+        </w:rPr>
+        <w:t>Psychological profile. ESC interest profile; conscientiousness very high; emotional regulation robust; collaborative style moderate.</w:t>
+      </w:r>
+    </w:p>
+    <w:p>
+      <w:r>
+        <w:rPr>
+          <w:b w:val="0"/>
+        </w:rPr>
+        <w:t>Assessment center. Assessment center (case: campaign launch under scope and budget pressure): overall 2.7/5.0. Standouts: Adaptability, Planning and Organization. Growth areas: Financial Awareness, Stakeholder Communication. Behavior in the group and individual exercises was consistent with the psychometric profile.</w:t>
+      </w:r>
+    </w:p>
+    <w:p>
+      <w:r>
+        <w:rPr>
+          <w:b w:val="0"/>
+        </w:rPr>
+        <w:t>Primary watch-out. CV attainment is the weakest of the five components (69/100); it should be managed consciously in the first months.</w:t>
+      </w:r>
+    </w:p>
+    <w:p>
+      <w:pPr>
+        <w:spacing w:before="240"/>
+      </w:pPr>
+      <w:r>
+        <w:rPr>
+          <w:b/>
+          <w:sz w:val="22"/>
+        </w:rPr>
+        <w:t>6.2  Alejandra Perez  -  Strongest behavioral profile</w:t>
+      </w:r>
+    </w:p>
+    <w:p>
+      <w:r>
+        <w:rPr>
+          <w:b/>
+        </w:rPr>
+        <w:t>Fit index 73.6/100 (label High); assessment center 3.6/5.0; Holland code ECS; 6 years of experience; 1 certifications.</w:t>
+      </w:r>
+    </w:p>
+    <w:p>
+      <w:r>
+        <w:rPr>
+          <w:b w:val="0"/>
+        </w:rPr>
+        <w:t>Why this recommendation. Best behavioral evidence in the assessment center (3.6/5.0) within a solid overall fit (73.6/100). Recommended when stakeholder handling, execution and team integration carry the greatest weight.</w:t>
+      </w:r>
+    </w:p>
+    <w:p>
+      <w:r>
+        <w:rPr>
+          <w:b w:val="0"/>
+        </w:rPr>
+        <w:t>Psychological profile. ECS interest profile; conscientiousness low; emotional regulation robust; collaborative style high.</w:t>
+      </w:r>
+    </w:p>
+    <w:p>
+      <w:r>
+        <w:rPr>
+          <w:b w:val="0"/>
+        </w:rPr>
+        <w:t>Assessment center. Assessment center (case: campaign launch under scope and budget pressure): overall 3.6/5.0. Standouts: Planning and Organization, Client Orientation. Growth areas: Team Leadership, Problem Solving. Behavior in the group and individual exercises was consistent with the psychometric profile.</w:t>
+      </w:r>
+    </w:p>
+    <w:p>
+      <w:r>
+        <w:rPr>
+          <w:b w:val="0"/>
+        </w:rPr>
+        <w:t>Primary watch-out. Integrity attainment is the weakest of the five components (56/100); it should be managed consciously in the first months.</w:t>
+      </w:r>
+    </w:p>
+    <w:p>
+      <w:pPr>
+        <w:spacing w:before="240"/>
+      </w:pPr>
+      <w:r>
+        <w:rPr>
+          <w:b/>
+          <w:sz w:val="22"/>
+        </w:rPr>
+        <w:t>6.3  Gabriela Perez  -  Highest growth potential</w:t>
+      </w:r>
+    </w:p>
+    <w:p>
+      <w:r>
+        <w:rPr>
+          <w:b/>
+        </w:rPr>
+        <w:t>Fit index 82.3/100 (label High); assessment center 3.4/5.0; Holland code SCE; 3 years of experience; 4 certifications.</w:t>
+      </w:r>
+    </w:p>
+    <w:p>
+      <w:r>
+        <w:rPr>
+          <w:b w:val="0"/>
+        </w:rPr>
+        <w:t>Why this recommendation. Highest cognitive ability in the viable pool (ICAR percentile 95) combined with a strong fit index (82.3/100); the best option to grow into senior or program responsibility within 12-24 months while delivering immediately.</w:t>
+      </w:r>
+    </w:p>
+    <w:p>
+      <w:r>
+        <w:rPr>
+          <w:b w:val="0"/>
+        </w:rPr>
+        <w:t>Psychological profile. SCE interest profile; conscientiousness low; emotional regulation developing; collaborative style high.</w:t>
+      </w:r>
+    </w:p>
+    <w:p>
+      <w:r>
+        <w:rPr>
+          <w:b w:val="0"/>
+        </w:rPr>
+        <w:t>Assessment center. Assessment center (case: campaign launch under scope and budget pressure): overall 3.4/5.0. Standouts: Client Orientation, Adaptability. Growth areas: Stakeholder Communication, Team Leadership. Behavior in the group and individual exercises was consistent with the psychometric profile.</w:t>
+      </w:r>
+    </w:p>
+    <w:p>
+      <w:r>
+        <w:rPr>
+          <w:b w:val="0"/>
+        </w:rPr>
+        <w:t>Primary watch-out. Personality attainment is the weakest of the five components (66/100); it should be managed consciously in the first months.</w:t>
       </w:r>
     </w:p>
     <w:p>
@@ -2069,15 +3316,7 @@
           <w:b/>
           <w:sz w:val="25"/>
         </w:rPr>
-        <w:t>6. Conclusions and recommendations</w:t>
-      </w:r>
-    </w:p>
-    <w:p>
-      <w:r>
-        <w:rPr>
-          <w:b/>
-        </w:rPr>
-        <w:t>Conclusions.</w:t>
+        <w:t>7. Next steps</w:t>
       </w:r>
     </w:p>
     <w:p>
@@ -2085,7 +3324,7 @@
         <w:pStyle w:val="ListBullet"/>
       </w:pPr>
       <w:r>
-        <w:t>The fit index integrates the full evidence base into one auditable number; its range (42.8-91.7) confirms it discriminates among applicants rather than returning a ceiling effect.</w:t>
+        <w:t>Make the offer to the first choice and, in parallel, notify the other two finalists that they remain contenders if the first offer is declined - all three are offer-viable.</w:t>
       </w:r>
     </w:p>
     <w:p>
@@ -2093,7 +3332,7 @@
         <w:pStyle w:val="ListBullet"/>
       </w:pPr>
       <w:r>
-        <w:t>Structured cognitive and personality indicators drive the recommendation; experience alone is a weak proxy for person-job fit (r = 0.48).</w:t>
+        <w:t>Agree the start date and a 90-day plan: portfolio ownership, live client dashboards and delivery KPIs.</w:t>
       </w:r>
     </w:p>
     <w:p>
@@ -2101,47 +3340,7 @@
         <w:pStyle w:val="ListBullet"/>
       </w:pPr>
       <w:r>
-        <w:t>The dashboard gives Meridian Digital's decision maker full visibility: every candidate can be explored at the level of individual indicators and facets before a final offer.</w:t>
-      </w:r>
-    </w:p>
-    <w:p>
-      <w:r>
-        <w:rPr>
-          <w:b/>
-        </w:rPr>
-        <w:t>Recommendations for Meridian Digital.</w:t>
-      </w:r>
-    </w:p>
-    <w:p>
-      <w:pPr>
-        <w:pStyle w:val="ListBullet"/>
-      </w:pPr>
-      <w:r>
-        <w:t>Adopt the fit-index workflow as the standard pre-offer gate for this role, and consider extending it to other agency positions.</w:t>
-      </w:r>
-    </w:p>
-    <w:p>
-      <w:pPr>
-        <w:pStyle w:val="ListBullet"/>
-      </w:pPr>
-      <w:r>
-        <w:t>Use the assessment center for the finalists only, and keep interviews focused on evidence the instruments cannot capture.</w:t>
-      </w:r>
-    </w:p>
-    <w:p>
-      <w:pPr>
-        <w:pStyle w:val="ListBullet"/>
-      </w:pPr>
-      <w:r>
-        <w:t>Recalibrate the component weights and the High/Medium/Low bands after six months of on-the-job performance data.</w:t>
-      </w:r>
-    </w:p>
-    <w:p>
-      <w:pPr>
-        <w:pStyle w:val="ListBullet"/>
-      </w:pPr>
-      <w:r>
-        <w:t>Assign a named decision maker to review the shortlist in the dashboard before the final offer.</w:t>
+        <w:t>Revisit this dashboard six months after hiring to recalibrate weights and bands with on-the-job performance data.</w:t>
       </w:r>
     </w:p>
     <w:sectPr>

</xml_diff>